<commit_message>
add materials + final project
</commit_message>
<xml_diff>
--- a/DS-PY-Data-Science/DS-NA-001 VISUALIZAÇÃO DE DADOS COM POWER BI/Material do Professor/Projeto-Final/Projeto Final PowerBI.docx
+++ b/DS-PY-Data-Science/DS-NA-001 VISUALIZAÇÃO DE DADOS COM POWER BI/Material do Professor/Projeto-Final/Projeto Final PowerBI.docx
@@ -1511,6 +1511,7 @@
           <w:b/>
           <w:bCs/>
         </w:rPr>
+        <w:lastRenderedPageBreak/>
         <w:t>Entrega</w:t>
       </w:r>
     </w:p>
@@ -1552,36 +1553,6 @@
           <w:lang w:val="pt-PT"/>
         </w:rPr>
         <w:t xml:space="preserve"> do dashboard</w:t>
-      </w:r>
-    </w:p>
-    <w:p>
-      <w:pPr>
-        <w:numPr>
-          <w:ilvl w:val="1"/>
-          <w:numId w:val="2"/>
-        </w:numPr>
-        <w:rPr>
-          <w:lang w:val="pt-PT"/>
-        </w:rPr>
-      </w:pPr>
-      <w:r>
-        <w:rPr>
-          <w:lang w:val="pt-PT"/>
-        </w:rPr>
-        <w:lastRenderedPageBreak/>
-        <w:t>L</w:t>
-      </w:r>
-      <w:r>
-        <w:rPr>
-          <w:lang w:val="pt-PT"/>
-        </w:rPr>
-        <w:t>ink para o dataset no Kaggle</w:t>
-      </w:r>
-      <w:r>
-        <w:rPr>
-          <w:lang w:val="pt-PT"/>
-        </w:rPr>
-        <w:t xml:space="preserve"> e/ou base de dados (csv, sql, excel, ...)</w:t>
       </w:r>
     </w:p>
     <w:p>
@@ -3020,21 +2991,7 @@
             <w:rStyle w:val="Hyperlink"/>
             <w:lang w:val="pt-PT"/>
           </w:rPr>
-          <w:t>https://zoomcharts.com/en/microsoft-power-bi-custom-visuals/dashboard-and-repor</w:t>
-        </w:r>
-        <w:r>
-          <w:rPr>
-            <w:rStyle w:val="Hyperlink"/>
-            <w:lang w:val="pt-PT"/>
-          </w:rPr>
-          <w:t>t</w:t>
-        </w:r>
-        <w:r>
-          <w:rPr>
-            <w:rStyle w:val="Hyperlink"/>
-            <w:lang w:val="pt-PT"/>
-          </w:rPr>
-          <w:t>-examples</w:t>
+          <w:t>https://zoomcharts.com/en/microsoft-power-bi-custom-visuals/dashboard-and-report-examples</w:t>
         </w:r>
       </w:hyperlink>
     </w:p>
@@ -3052,6 +3009,7 @@
         <w:rPr>
           <w:lang w:val="pt-PT"/>
         </w:rPr>
+        <w:lastRenderedPageBreak/>
         <w:t xml:space="preserve">Arquivos .pbix </w:t>
       </w:r>
       <w:r>
@@ -5902,6 +5860,7 @@
   <w:style w:type="character" w:default="1" w:styleId="DefaultParagraphFont">
     <w:name w:val="Default Paragraph Font"/>
     <w:uiPriority w:val="1"/>
+    <w:semiHidden/>
     <w:unhideWhenUsed/>
   </w:style>
   <w:style w:type="table" w:default="1" w:styleId="TableNormal">

</xml_diff>